<commit_message>
QA docs: use the standard English QA terms (smoke test, test case, bug report, severity)
Co-Authored-By: Claude Fable 5.1 <noreply@anthropic.com>
</commit_message>
<xml_diff>
--- a/docs/qa/Teach — тестовая документация QA.docx
+++ b/docs/qa/Teach — тестовая документация QA.docx
@@ -20,7 +20,7 @@
         <w:rPr>
           <w:sz w:val="32"/>
         </w:rPr>
-        <w:t>Тестовая документация для junior QA</w:t>
+        <w:t>Test documentation для junior QA</w:t>
       </w:r>
     </w:p>
     <w:p>
@@ -111,7 +111,7 @@
               <w:rPr>
                 <w:sz w:val="19"/>
               </w:rPr>
-              <w:t>1.0 · 10 сентября 2026</w:t>
+              <w:t>1.1 · 11 сентября 2026</w:t>
             </w:r>
           </w:p>
         </w:tc>
@@ -130,7 +130,7 @@
               <w:rPr>
                 <w:sz w:val="19"/>
               </w:rPr>
-              <w:t>Проверяемая сборка</w:t>
+              <w:t>Build под тест</w:t>
             </w:r>
           </w:p>
         </w:tc>
@@ -147,7 +147,7 @@
               <w:rPr>
                 <w:sz w:val="19"/>
               </w:rPr>
-              <w:t>Teach 0.1.0, сборка 13 в TestFlight (или новее — номер сборки указывайте в отчёте)</w:t>
+              <w:t>Teach 0.1.0, build 13 в TestFlight (или новее — номер build указывайте в bug report)</w:t>
             </w:r>
           </w:p>
         </w:tc>
@@ -255,7 +255,7 @@
               <w:rPr>
                 <w:sz w:val="19"/>
               </w:rPr>
-              <w:t>Тестировщик без опыта в проекте: документ ведёт от установки сборки до отчёта о баге</w:t>
+              <w:t>Тестировщик без опыта в проекте: документ ведёт от установки build до bug report</w:t>
             </w:r>
           </w:p>
         </w:tc>
@@ -283,7 +283,7 @@
           <w:b w:val="0"/>
           <w:i w:val="0"/>
         </w:rPr>
-        <w:t>Документ состоит из подготовки (раздел 3), дымового прогона на 10 минут (раздел 4), полных тест-кейсов по областям (раздел 5) и приложений с шаблоном отчёта и словарём терминов. Каждый тест-кейс имеет номер, предусловия, пронумерованные шаги и ожидаемый результат. Отмечайте результат в последней колонке: OK — совпало с ожиданием, FAIL — нет; на каждый FAIL заводится отчёт по шаблону из приложения A.</w:t>
+        <w:t>Документ состоит из подготовки (раздел 3), smoke test на 10 минут (раздел 4), полного набора test cases по областям (раздел 5) и приложений с шаблоном bug report и словарём терминов. Каждый test case имеет ID, preconditions, пронумерованные steps и expected result. Отмечайте результат в последней колонке: PASS — совпало с ожиданием, FAIL — нет; на каждый FAIL заводится bug report по шаблону из приложения A.</w:t>
       </w:r>
     </w:p>
     <w:p>
@@ -295,10 +295,10 @@
         <w:rPr>
           <w:b/>
         </w:rPr>
-        <w:t xml:space="preserve">Дымовой прогон </w:t>
+        <w:t xml:space="preserve">Smoke test </w:t>
       </w:r>
       <w:r>
-        <w:t>делается на каждой новой сборке первым. Если он не проходит, полный прогон не начинайте — сообщите сразу.</w:t>
+        <w:t>делается на каждом новом build первым. Если он не проходит, full regression не начинайте — сообщите сразу.</w:t>
       </w:r>
     </w:p>
     <w:p>
@@ -310,10 +310,10 @@
         <w:rPr>
           <w:b/>
         </w:rPr>
-        <w:t xml:space="preserve">Полный прогон </w:t>
+        <w:t xml:space="preserve">Full regression </w:t>
       </w:r>
       <w:r>
-        <w:t>делается по областям, порядок разделов 5.1 → 5.12 удобен, потому что каждая область готовит данные для следующей.</w:t>
+        <w:t>делается по областям, порядок разделов 5.1 → 5.12 удобен, потому что каждая область готовит test data для следующей.</w:t>
       </w:r>
     </w:p>
     <w:p>
@@ -328,7 +328,7 @@
         <w:t xml:space="preserve">Время ожидания </w:t>
       </w:r>
       <w:r>
-        <w:t>указано в ожидаемых результатах: это нормальные значения. Если ждёте заметно дольше, это тоже наблюдение для отчёта, с точным временем.</w:t>
+        <w:t>указано в expected result: это нормальные значения. Если ждёте заметно дольше, это тоже наблюдение для bug report, с точным временем.</w:t>
       </w:r>
     </w:p>
     <w:p>
@@ -476,7 +476,7 @@
               <w:rPr>
                 <w:sz w:val="19"/>
               </w:rPr>
-              <w:t>Проверка входа, выхода, сохранности данных</w:t>
+              <w:t>Login, logout, сохранность данных</w:t>
             </w:r>
           </w:p>
         </w:tc>
@@ -635,7 +635,7 @@
               <w:rPr>
                 <w:sz w:val="19"/>
               </w:rPr>
-              <w:t>Сетевые шаги, ожидания, ошибки сети</w:t>
+              <w:t>Сетевые шаги, timeouts, network errors</w:t>
             </w:r>
           </w:p>
         </w:tc>
@@ -1004,7 +1004,7 @@
         <w:spacing w:after="40"/>
       </w:pPr>
       <w:r>
-        <w:t>После принятия в TestFlight появляется Teach. Устанавливайте последнюю сборку; номер сборки виден в TestFlight и нужен в каждом отчёте.</w:t>
+        <w:t>После принятия в TestFlight появляется Teach. Устанавливайте последний build; номер build виден в TestFlight и нужен в каждом bug report.</w:t>
       </w:r>
     </w:p>
     <w:p>
@@ -1013,7 +1013,7 @@
         <w:spacing w:after="40"/>
       </w:pPr>
       <w:r>
-        <w:t>Обновление сборки не удаляет данные: предметы, повторы и настройки остаются. Если после обновления данные пропали — это баг.</w:t>
+        <w:t>Обновление build не удаляет данные: предметы, повторы и настройки остаются. Если после обновления данные пропали — это bug.</w:t>
       </w:r>
     </w:p>
     <w:p>
@@ -1068,7 +1068,7 @@
           <w:b w:val="0"/>
           <w:i w:val="0"/>
         </w:rPr>
-        <w:t>Приложение уже знает адрес сервера и токен, вручную их вводить не нужно. Токен понадобится только для проверок через API (раздел 5.12): его выдаёт владелец проекта лично. Токен нельзя публиковать, пересылать в общие чаты и вставлять в отчёты. Документация API открыта без токена: https://teach-tutor-api.fly.dev/docs/ и https://teach-tutor-api.fly.dev/scalar/.</w:t>
+        <w:t>Приложение уже знает адрес сервера и токен, вручную их вводить не нужно. Токен понадобится только для проверок через API (раздел 5.12): его выдаёт владелец проекта лично. Токен нельзя публиковать, пересылать в общие чаты и вставлять в bug reports. Документация API открыта без токена: https://teach-tutor-api.fly.dev/docs/ и https://teach-tutor-api.fly.dev/scalar/.</w:t>
       </w:r>
     </w:p>
     <w:p>
@@ -1112,7 +1112,7 @@
         <w:spacing w:after="40"/>
       </w:pPr>
       <w:r>
-        <w:t>Секундомер или часы: в отчётах указывайте время события, по нему находят записи в логах сервера.</w:t>
+        <w:t>Секундомер или часы: в bug report указывайте время события, по нему находят записи в server logs.</w:t>
       </w:r>
     </w:p>
     <w:p>
@@ -1120,7 +1120,7 @@
         <w:pStyle w:val="Heading2"/>
       </w:pPr>
       <w:r>
-        <w:t>3.5 Как сообщать о находках</w:t>
+        <w:t>3.5 Как оформлять bug report</w:t>
       </w:r>
     </w:p>
     <w:p>
@@ -1132,7 +1132,7 @@
           <w:b w:val="0"/>
           <w:i w:val="0"/>
         </w:rPr>
-        <w:t>На каждый FAIL — отдельный отчёт по шаблону из приложения A. Обязательно: номер сборки, модель телефона и версия iOS, шаги, ожидание, факт, скриншот или запись экрана, время события. Для предмета, созданного через мастер, добавьте его название и тему: по ним предмет находят на сервере. Не объединяйте несколько багов в один отчёт.</w:t>
+        <w:t>На каждый FAIL — отдельный bug report по шаблону из приложения A. Обязательно: номер build, модель телефона и версия iOS, steps to reproduce, expected result, actual result, скриншот или screen recording, время события. Для предмета, созданного через мастер, добавьте его название и тему: по ним предмет находят на сервере. Не объединяйте несколько bugs в один report.</w:t>
       </w:r>
     </w:p>
     <w:p>
@@ -1140,7 +1140,7 @@
         <w:pStyle w:val="Heading1"/>
       </w:pPr>
       <w:r>
-        <w:t>4. Дымовой прогон новой сборки (≈ 10 минут)</w:t>
+        <w:t>4. Smoke test нового build (≈ 10 минут)</w:t>
       </w:r>
     </w:p>
     <w:p>
@@ -1152,7 +1152,7 @@
           <w:b w:val="0"/>
           <w:i w:val="0"/>
         </w:rPr>
-        <w:t>Делается на каждой сборке до полного прогона. Все пункты должны быть OK.</w:t>
+        <w:t>Делается на каждом build до full regression. Все пункты должны быть PASS.</w:t>
       </w:r>
     </w:p>
     <w:tbl>
@@ -1197,7 +1197,7 @@
                 <w:b/>
                 <w:sz w:val="19"/>
               </w:rPr>
-              <w:t>Действие</w:t>
+              <w:t>Action</w:t>
             </w:r>
           </w:p>
         </w:tc>
@@ -1213,7 +1213,7 @@
                 <w:b/>
                 <w:sz w:val="19"/>
               </w:rPr>
-              <w:t>Ожидание</w:t>
+              <w:t>Expected result</w:t>
             </w:r>
           </w:p>
         </w:tc>
@@ -1229,7 +1229,7 @@
                 <w:b/>
                 <w:sz w:val="19"/>
               </w:rPr>
-              <w:t>OK</w:t>
+              <w:t>PASS</w:t>
             </w:r>
           </w:p>
         </w:tc>
@@ -1875,7 +1875,7 @@
         <w:pStyle w:val="Heading1"/>
       </w:pPr>
       <w:r>
-        <w:t>5. Тест-кейсы</w:t>
+        <w:t>5. Test cases</w:t>
       </w:r>
     </w:p>
     <w:p>
@@ -1887,7 +1887,7 @@
           <w:b w:val="0"/>
           <w:i w:val="0"/>
         </w:rPr>
-        <w:t>Обозначения: «свой предмет» — предмет, созданный через мастер; «демо» — предустановленные «Английский» и «Публичные выступления». В шагах «→» означает переход.</w:t>
+        <w:t>Обозначения: «свой предмет» — предмет, созданный через мастер; «демо» — предустановленные «Английский» и «Публичные выступления». В steps «→» означает переход. Preconditions описывают состояние до первого шага.</w:t>
       </w:r>
     </w:p>
     <w:p>
@@ -1942,7 +1942,7 @@
                 <w:b/>
                 <w:sz w:val="18"/>
               </w:rPr>
-              <w:t>Проверка</w:t>
+              <w:t>Test case</w:t>
             </w:r>
           </w:p>
         </w:tc>
@@ -1958,7 +1958,7 @@
                 <w:b/>
                 <w:sz w:val="18"/>
               </w:rPr>
-              <w:t>Предусловия</w:t>
+              <w:t>Preconditions</w:t>
             </w:r>
           </w:p>
         </w:tc>
@@ -1974,7 +1974,7 @@
                 <w:b/>
                 <w:sz w:val="18"/>
               </w:rPr>
-              <w:t>Шаги</w:t>
+              <w:t>Steps</w:t>
             </w:r>
           </w:p>
         </w:tc>
@@ -1990,7 +1990,7 @@
                 <w:b/>
                 <w:sz w:val="18"/>
               </w:rPr>
-              <w:t>Ожидаемый результат</w:t>
+              <w:t>Expected result</w:t>
             </w:r>
           </w:p>
         </w:tc>
@@ -2006,7 +2006,7 @@
                 <w:b/>
                 <w:sz w:val="18"/>
               </w:rPr>
-              <w:t>Результат</w:t>
+              <w:t>Result</w:t>
             </w:r>
           </w:p>
         </w:tc>
@@ -2132,7 +2132,7 @@
               <w:rPr>
                 <w:sz w:val="18"/>
               </w:rPr>
-              <w:t>☐ OK</w:t>
+              <w:t>☐ PASS</w:t>
               <w:br/>
               <w:t>☐ FAIL</w:t>
             </w:r>
@@ -2271,7 +2271,7 @@
               <w:rPr>
                 <w:sz w:val="18"/>
               </w:rPr>
-              <w:t>☐ OK</w:t>
+              <w:t>☐ PASS</w:t>
               <w:br/>
               <w:t>☐ FAIL</w:t>
             </w:r>
@@ -2377,7 +2377,7 @@
               <w:rPr>
                 <w:sz w:val="18"/>
               </w:rPr>
-              <w:t>☐ OK</w:t>
+              <w:t>☐ PASS</w:t>
               <w:br/>
               <w:t>☐ FAIL</w:t>
             </w:r>
@@ -2494,7 +2494,7 @@
               <w:rPr>
                 <w:sz w:val="18"/>
               </w:rPr>
-              <w:t>☐ OK</w:t>
+              <w:t>☐ PASS</w:t>
               <w:br/>
               <w:t>☐ FAIL</w:t>
             </w:r>
@@ -2559,7 +2559,7 @@
                 <w:b/>
                 <w:sz w:val="18"/>
               </w:rPr>
-              <w:t>Проверка</w:t>
+              <w:t>Test case</w:t>
             </w:r>
           </w:p>
         </w:tc>
@@ -2575,7 +2575,7 @@
                 <w:b/>
                 <w:sz w:val="18"/>
               </w:rPr>
-              <w:t>Предусловия</w:t>
+              <w:t>Preconditions</w:t>
             </w:r>
           </w:p>
         </w:tc>
@@ -2591,7 +2591,7 @@
                 <w:b/>
                 <w:sz w:val="18"/>
               </w:rPr>
-              <w:t>Шаги</w:t>
+              <w:t>Steps</w:t>
             </w:r>
           </w:p>
         </w:tc>
@@ -2607,7 +2607,7 @@
                 <w:b/>
                 <w:sz w:val="18"/>
               </w:rPr>
-              <w:t>Ожидаемый результат</w:t>
+              <w:t>Expected result</w:t>
             </w:r>
           </w:p>
         </w:tc>
@@ -2623,7 +2623,7 @@
                 <w:b/>
                 <w:sz w:val="18"/>
               </w:rPr>
-              <w:t>Результат</w:t>
+              <w:t>Result</w:t>
             </w:r>
           </w:p>
         </w:tc>
@@ -2738,7 +2738,7 @@
               <w:rPr>
                 <w:sz w:val="18"/>
               </w:rPr>
-              <w:t>☐ OK</w:t>
+              <w:t>☐ PASS</w:t>
               <w:br/>
               <w:t>☐ FAIL</w:t>
             </w:r>
@@ -2855,7 +2855,7 @@
               <w:rPr>
                 <w:sz w:val="18"/>
               </w:rPr>
-              <w:t>☐ OK</w:t>
+              <w:t>☐ PASS</w:t>
               <w:br/>
               <w:t>☐ FAIL</w:t>
             </w:r>
@@ -2961,7 +2961,7 @@
               <w:rPr>
                 <w:sz w:val="18"/>
               </w:rPr>
-              <w:t>☐ OK</w:t>
+              <w:t>☐ PASS</w:t>
               <w:br/>
               <w:t>☐ FAIL</w:t>
             </w:r>
@@ -3100,7 +3100,7 @@
               <w:rPr>
                 <w:sz w:val="18"/>
               </w:rPr>
-              <w:t>☐ OK</w:t>
+              <w:t>☐ PASS</w:t>
               <w:br/>
               <w:t>☐ FAIL</w:t>
             </w:r>
@@ -3206,7 +3206,7 @@
               <w:rPr>
                 <w:sz w:val="18"/>
               </w:rPr>
-              <w:t>☐ OK</w:t>
+              <w:t>☐ PASS</w:t>
               <w:br/>
               <w:t>☐ FAIL</w:t>
             </w:r>
@@ -3271,7 +3271,7 @@
                 <w:b/>
                 <w:sz w:val="18"/>
               </w:rPr>
-              <w:t>Проверка</w:t>
+              <w:t>Test case</w:t>
             </w:r>
           </w:p>
         </w:tc>
@@ -3287,7 +3287,7 @@
                 <w:b/>
                 <w:sz w:val="18"/>
               </w:rPr>
-              <w:t>Предусловия</w:t>
+              <w:t>Preconditions</w:t>
             </w:r>
           </w:p>
         </w:tc>
@@ -3303,7 +3303,7 @@
                 <w:b/>
                 <w:sz w:val="18"/>
               </w:rPr>
-              <w:t>Шаги</w:t>
+              <w:t>Steps</w:t>
             </w:r>
           </w:p>
         </w:tc>
@@ -3319,7 +3319,7 @@
                 <w:b/>
                 <w:sz w:val="18"/>
               </w:rPr>
-              <w:t>Ожидаемый результат</w:t>
+              <w:t>Expected result</w:t>
             </w:r>
           </w:p>
         </w:tc>
@@ -3335,7 +3335,7 @@
                 <w:b/>
                 <w:sz w:val="18"/>
               </w:rPr>
-              <w:t>Результат</w:t>
+              <w:t>Result</w:t>
             </w:r>
           </w:p>
         </w:tc>
@@ -3461,7 +3461,7 @@
               <w:rPr>
                 <w:sz w:val="18"/>
               </w:rPr>
-              <w:t>☐ OK</w:t>
+              <w:t>☐ PASS</w:t>
               <w:br/>
               <w:t>☐ FAIL</w:t>
             </w:r>
@@ -3589,7 +3589,7 @@
               <w:rPr>
                 <w:sz w:val="18"/>
               </w:rPr>
-              <w:t>☐ OK</w:t>
+              <w:t>☐ PASS</w:t>
               <w:br/>
               <w:t>☐ FAIL</w:t>
             </w:r>
@@ -3706,7 +3706,7 @@
               <w:rPr>
                 <w:sz w:val="18"/>
               </w:rPr>
-              <w:t>☐ OK</w:t>
+              <w:t>☐ PASS</w:t>
               <w:br/>
               <w:t>☐ FAIL</w:t>
             </w:r>
@@ -3834,7 +3834,7 @@
               <w:rPr>
                 <w:sz w:val="18"/>
               </w:rPr>
-              <w:t>☐ OK</w:t>
+              <w:t>☐ PASS</w:t>
               <w:br/>
               <w:t>☐ FAIL</w:t>
             </w:r>
@@ -3962,7 +3962,7 @@
               <w:rPr>
                 <w:sz w:val="18"/>
               </w:rPr>
-              <w:t>☐ OK</w:t>
+              <w:t>☐ PASS</w:t>
               <w:br/>
               <w:t>☐ FAIL</w:t>
             </w:r>
@@ -4079,7 +4079,7 @@
               <w:rPr>
                 <w:sz w:val="18"/>
               </w:rPr>
-              <w:t>☐ OK</w:t>
+              <w:t>☐ PASS</w:t>
               <w:br/>
               <w:t>☐ FAIL</w:t>
             </w:r>
@@ -4196,7 +4196,7 @@
               <w:rPr>
                 <w:sz w:val="18"/>
               </w:rPr>
-              <w:t>☐ OK</w:t>
+              <w:t>☐ PASS</w:t>
               <w:br/>
               <w:t>☐ FAIL</w:t>
             </w:r>
@@ -4302,7 +4302,7 @@
               <w:rPr>
                 <w:sz w:val="18"/>
               </w:rPr>
-              <w:t>☐ OK</w:t>
+              <w:t>☐ PASS</w:t>
               <w:br/>
               <w:t>☐ FAIL</w:t>
             </w:r>
@@ -4367,7 +4367,7 @@
                 <w:b/>
                 <w:sz w:val="18"/>
               </w:rPr>
-              <w:t>Проверка</w:t>
+              <w:t>Test case</w:t>
             </w:r>
           </w:p>
         </w:tc>
@@ -4383,7 +4383,7 @@
                 <w:b/>
                 <w:sz w:val="18"/>
               </w:rPr>
-              <w:t>Предусловия</w:t>
+              <w:t>Preconditions</w:t>
             </w:r>
           </w:p>
         </w:tc>
@@ -4399,7 +4399,7 @@
                 <w:b/>
                 <w:sz w:val="18"/>
               </w:rPr>
-              <w:t>Шаги</w:t>
+              <w:t>Steps</w:t>
             </w:r>
           </w:p>
         </w:tc>
@@ -4415,7 +4415,7 @@
                 <w:b/>
                 <w:sz w:val="18"/>
               </w:rPr>
-              <w:t>Ожидаемый результат</w:t>
+              <w:t>Expected result</w:t>
             </w:r>
           </w:p>
         </w:tc>
@@ -4431,7 +4431,7 @@
                 <w:b/>
                 <w:sz w:val="18"/>
               </w:rPr>
-              <w:t>Результат</w:t>
+              <w:t>Result</w:t>
             </w:r>
           </w:p>
         </w:tc>
@@ -4535,7 +4535,7 @@
               <w:rPr>
                 <w:sz w:val="18"/>
               </w:rPr>
-              <w:t>☐ OK</w:t>
+              <w:t>☐ PASS</w:t>
               <w:br/>
               <w:t>☐ FAIL</w:t>
             </w:r>
@@ -4663,7 +4663,7 @@
               <w:rPr>
                 <w:sz w:val="18"/>
               </w:rPr>
-              <w:t>☐ OK</w:t>
+              <w:t>☐ PASS</w:t>
               <w:br/>
               <w:t>☐ FAIL</w:t>
             </w:r>
@@ -4780,7 +4780,7 @@
               <w:rPr>
                 <w:sz w:val="18"/>
               </w:rPr>
-              <w:t>☐ OK</w:t>
+              <w:t>☐ PASS</w:t>
               <w:br/>
               <w:t>☐ FAIL</w:t>
             </w:r>
@@ -4908,7 +4908,7 @@
               <w:rPr>
                 <w:sz w:val="18"/>
               </w:rPr>
-              <w:t>☐ OK</w:t>
+              <w:t>☐ PASS</w:t>
               <w:br/>
               <w:t>☐ FAIL</w:t>
             </w:r>
@@ -5025,7 +5025,7 @@
               <w:rPr>
                 <w:sz w:val="18"/>
               </w:rPr>
-              <w:t>☐ OK</w:t>
+              <w:t>☐ PASS</w:t>
               <w:br/>
               <w:t>☐ FAIL</w:t>
             </w:r>
@@ -5131,7 +5131,7 @@
               <w:rPr>
                 <w:sz w:val="18"/>
               </w:rPr>
-              <w:t>☐ OK</w:t>
+              <w:t>☐ PASS</w:t>
               <w:br/>
               <w:t>☐ FAIL</w:t>
             </w:r>
@@ -5270,7 +5270,7 @@
               <w:rPr>
                 <w:sz w:val="18"/>
               </w:rPr>
-              <w:t>☐ OK</w:t>
+              <w:t>☐ PASS</w:t>
               <w:br/>
               <w:t>☐ FAIL</w:t>
             </w:r>
@@ -5387,7 +5387,7 @@
               <w:rPr>
                 <w:sz w:val="18"/>
               </w:rPr>
-              <w:t>☐ OK</w:t>
+              <w:t>☐ PASS</w:t>
               <w:br/>
               <w:t>☐ FAIL</w:t>
             </w:r>
@@ -5493,7 +5493,7 @@
               <w:rPr>
                 <w:sz w:val="18"/>
               </w:rPr>
-              <w:t>☐ OK</w:t>
+              <w:t>☐ PASS</w:t>
               <w:br/>
               <w:t>☐ FAIL</w:t>
             </w:r>
@@ -5610,7 +5610,7 @@
               <w:rPr>
                 <w:sz w:val="18"/>
               </w:rPr>
-              <w:t>☐ OK</w:t>
+              <w:t>☐ PASS</w:t>
               <w:br/>
               <w:t>☐ FAIL</w:t>
             </w:r>
@@ -5675,7 +5675,7 @@
                 <w:b/>
                 <w:sz w:val="18"/>
               </w:rPr>
-              <w:t>Проверка</w:t>
+              <w:t>Test case</w:t>
             </w:r>
           </w:p>
         </w:tc>
@@ -5691,7 +5691,7 @@
                 <w:b/>
                 <w:sz w:val="18"/>
               </w:rPr>
-              <w:t>Предусловия</w:t>
+              <w:t>Preconditions</w:t>
             </w:r>
           </w:p>
         </w:tc>
@@ -5707,7 +5707,7 @@
                 <w:b/>
                 <w:sz w:val="18"/>
               </w:rPr>
-              <w:t>Шаги</w:t>
+              <w:t>Steps</w:t>
             </w:r>
           </w:p>
         </w:tc>
@@ -5723,7 +5723,7 @@
                 <w:b/>
                 <w:sz w:val="18"/>
               </w:rPr>
-              <w:t>Ожидаемый результат</w:t>
+              <w:t>Expected result</w:t>
             </w:r>
           </w:p>
         </w:tc>
@@ -5739,7 +5739,7 @@
                 <w:b/>
                 <w:sz w:val="18"/>
               </w:rPr>
-              <w:t>Результат</w:t>
+              <w:t>Result</w:t>
             </w:r>
           </w:p>
         </w:tc>
@@ -5843,7 +5843,7 @@
               <w:rPr>
                 <w:sz w:val="18"/>
               </w:rPr>
-              <w:t>☐ OK</w:t>
+              <w:t>☐ PASS</w:t>
               <w:br/>
               <w:t>☐ FAIL</w:t>
             </w:r>
@@ -5949,7 +5949,7 @@
               <w:rPr>
                 <w:sz w:val="18"/>
               </w:rPr>
-              <w:t>☐ OK</w:t>
+              <w:t>☐ PASS</w:t>
               <w:br/>
               <w:t>☐ FAIL</w:t>
             </w:r>
@@ -6055,7 +6055,7 @@
               <w:rPr>
                 <w:sz w:val="18"/>
               </w:rPr>
-              <w:t>☐ OK</w:t>
+              <w:t>☐ PASS</w:t>
               <w:br/>
               <w:t>☐ FAIL</w:t>
             </w:r>
@@ -6161,7 +6161,7 @@
               <w:rPr>
                 <w:sz w:val="18"/>
               </w:rPr>
-              <w:t>☐ OK</w:t>
+              <w:t>☐ PASS</w:t>
               <w:br/>
               <w:t>☐ FAIL</w:t>
             </w:r>
@@ -6278,7 +6278,7 @@
               <w:rPr>
                 <w:sz w:val="18"/>
               </w:rPr>
-              <w:t>☐ OK</w:t>
+              <w:t>☐ PASS</w:t>
               <w:br/>
               <w:t>☐ FAIL</w:t>
             </w:r>
@@ -6395,7 +6395,7 @@
               <w:rPr>
                 <w:sz w:val="18"/>
               </w:rPr>
-              <w:t>☐ OK</w:t>
+              <w:t>☐ PASS</w:t>
               <w:br/>
               <w:t>☐ FAIL</w:t>
             </w:r>
@@ -6523,7 +6523,7 @@
               <w:rPr>
                 <w:sz w:val="18"/>
               </w:rPr>
-              <w:t>☐ OK</w:t>
+              <w:t>☐ PASS</w:t>
               <w:br/>
               <w:t>☐ FAIL</w:t>
             </w:r>
@@ -6640,7 +6640,7 @@
               <w:rPr>
                 <w:sz w:val="18"/>
               </w:rPr>
-              <w:t>☐ OK</w:t>
+              <w:t>☐ PASS</w:t>
               <w:br/>
               <w:t>☐ FAIL</w:t>
             </w:r>
@@ -6705,7 +6705,7 @@
                 <w:b/>
                 <w:sz w:val="18"/>
               </w:rPr>
-              <w:t>Проверка</w:t>
+              <w:t>Test case</w:t>
             </w:r>
           </w:p>
         </w:tc>
@@ -6721,7 +6721,7 @@
                 <w:b/>
                 <w:sz w:val="18"/>
               </w:rPr>
-              <w:t>Предусловия</w:t>
+              <w:t>Preconditions</w:t>
             </w:r>
           </w:p>
         </w:tc>
@@ -6737,7 +6737,7 @@
                 <w:b/>
                 <w:sz w:val="18"/>
               </w:rPr>
-              <w:t>Шаги</w:t>
+              <w:t>Steps</w:t>
             </w:r>
           </w:p>
         </w:tc>
@@ -6753,7 +6753,7 @@
                 <w:b/>
                 <w:sz w:val="18"/>
               </w:rPr>
-              <w:t>Ожидаемый результат</w:t>
+              <w:t>Expected result</w:t>
             </w:r>
           </w:p>
         </w:tc>
@@ -6769,7 +6769,7 @@
                 <w:b/>
                 <w:sz w:val="18"/>
               </w:rPr>
-              <w:t>Результат</w:t>
+              <w:t>Result</w:t>
             </w:r>
           </w:p>
         </w:tc>
@@ -6873,7 +6873,7 @@
               <w:rPr>
                 <w:sz w:val="18"/>
               </w:rPr>
-              <w:t>☐ OK</w:t>
+              <w:t>☐ PASS</w:t>
               <w:br/>
               <w:t>☐ FAIL</w:t>
             </w:r>
@@ -7001,7 +7001,7 @@
               <w:rPr>
                 <w:sz w:val="18"/>
               </w:rPr>
-              <w:t>☐ OK</w:t>
+              <w:t>☐ PASS</w:t>
               <w:br/>
               <w:t>☐ FAIL</w:t>
             </w:r>
@@ -7107,7 +7107,7 @@
               <w:rPr>
                 <w:sz w:val="18"/>
               </w:rPr>
-              <w:t>☐ OK</w:t>
+              <w:t>☐ PASS</w:t>
               <w:br/>
               <w:t>☐ FAIL</w:t>
             </w:r>
@@ -7224,7 +7224,7 @@
               <w:rPr>
                 <w:sz w:val="18"/>
               </w:rPr>
-              <w:t>☐ OK</w:t>
+              <w:t>☐ PASS</w:t>
               <w:br/>
               <w:t>☐ FAIL</w:t>
             </w:r>
@@ -7330,7 +7330,7 @@
               <w:rPr>
                 <w:sz w:val="18"/>
               </w:rPr>
-              <w:t>☐ OK</w:t>
+              <w:t>☐ PASS</w:t>
               <w:br/>
               <w:t>☐ FAIL</w:t>
             </w:r>
@@ -7447,7 +7447,7 @@
               <w:rPr>
                 <w:sz w:val="18"/>
               </w:rPr>
-              <w:t>☐ OK</w:t>
+              <w:t>☐ PASS</w:t>
               <w:br/>
               <w:t>☐ FAIL</w:t>
             </w:r>
@@ -7575,7 +7575,7 @@
               <w:rPr>
                 <w:sz w:val="18"/>
               </w:rPr>
-              <w:t>☐ OK</w:t>
+              <w:t>☐ PASS</w:t>
               <w:br/>
               <w:t>☐ FAIL</w:t>
             </w:r>
@@ -7640,7 +7640,7 @@
                 <w:b/>
                 <w:sz w:val="18"/>
               </w:rPr>
-              <w:t>Проверка</w:t>
+              <w:t>Test case</w:t>
             </w:r>
           </w:p>
         </w:tc>
@@ -7656,7 +7656,7 @@
                 <w:b/>
                 <w:sz w:val="18"/>
               </w:rPr>
-              <w:t>Предусловия</w:t>
+              <w:t>Preconditions</w:t>
             </w:r>
           </w:p>
         </w:tc>
@@ -7672,7 +7672,7 @@
                 <w:b/>
                 <w:sz w:val="18"/>
               </w:rPr>
-              <w:t>Шаги</w:t>
+              <w:t>Steps</w:t>
             </w:r>
           </w:p>
         </w:tc>
@@ -7688,7 +7688,7 @@
                 <w:b/>
                 <w:sz w:val="18"/>
               </w:rPr>
-              <w:t>Ожидаемый результат</w:t>
+              <w:t>Expected result</w:t>
             </w:r>
           </w:p>
         </w:tc>
@@ -7704,7 +7704,7 @@
                 <w:b/>
                 <w:sz w:val="18"/>
               </w:rPr>
-              <w:t>Результат</w:t>
+              <w:t>Result</w:t>
             </w:r>
           </w:p>
         </w:tc>
@@ -7808,7 +7808,7 @@
               <w:rPr>
                 <w:sz w:val="18"/>
               </w:rPr>
-              <w:t>☐ OK</w:t>
+              <w:t>☐ PASS</w:t>
               <w:br/>
               <w:t>☐ FAIL</w:t>
             </w:r>
@@ -7914,7 +7914,7 @@
               <w:rPr>
                 <w:sz w:val="18"/>
               </w:rPr>
-              <w:t>☐ OK</w:t>
+              <w:t>☐ PASS</w:t>
               <w:br/>
               <w:t>☐ FAIL</w:t>
             </w:r>
@@ -8020,7 +8020,7 @@
               <w:rPr>
                 <w:sz w:val="18"/>
               </w:rPr>
-              <w:t>☐ OK</w:t>
+              <w:t>☐ PASS</w:t>
               <w:br/>
               <w:t>☐ FAIL</w:t>
             </w:r>
@@ -8126,7 +8126,7 @@
               <w:rPr>
                 <w:sz w:val="18"/>
               </w:rPr>
-              <w:t>☐ OK</w:t>
+              <w:t>☐ PASS</w:t>
               <w:br/>
               <w:t>☐ FAIL</w:t>
             </w:r>
@@ -8243,7 +8243,7 @@
               <w:rPr>
                 <w:sz w:val="18"/>
               </w:rPr>
-              <w:t>☐ OK</w:t>
+              <w:t>☐ PASS</w:t>
               <w:br/>
               <w:t>☐ FAIL</w:t>
             </w:r>
@@ -8349,7 +8349,7 @@
               <w:rPr>
                 <w:sz w:val="18"/>
               </w:rPr>
-              <w:t>☐ OK</w:t>
+              <w:t>☐ PASS</w:t>
               <w:br/>
               <w:t>☐ FAIL</w:t>
             </w:r>
@@ -8414,7 +8414,7 @@
                 <w:b/>
                 <w:sz w:val="18"/>
               </w:rPr>
-              <w:t>Проверка</w:t>
+              <w:t>Test case</w:t>
             </w:r>
           </w:p>
         </w:tc>
@@ -8430,7 +8430,7 @@
                 <w:b/>
                 <w:sz w:val="18"/>
               </w:rPr>
-              <w:t>Предусловия</w:t>
+              <w:t>Preconditions</w:t>
             </w:r>
           </w:p>
         </w:tc>
@@ -8446,7 +8446,7 @@
                 <w:b/>
                 <w:sz w:val="18"/>
               </w:rPr>
-              <w:t>Шаги</w:t>
+              <w:t>Steps</w:t>
             </w:r>
           </w:p>
         </w:tc>
@@ -8462,7 +8462,7 @@
                 <w:b/>
                 <w:sz w:val="18"/>
               </w:rPr>
-              <w:t>Ожидаемый результат</w:t>
+              <w:t>Expected result</w:t>
             </w:r>
           </w:p>
         </w:tc>
@@ -8478,7 +8478,7 @@
                 <w:b/>
                 <w:sz w:val="18"/>
               </w:rPr>
-              <w:t>Результат</w:t>
+              <w:t>Result</w:t>
             </w:r>
           </w:p>
         </w:tc>
@@ -8582,7 +8582,7 @@
               <w:rPr>
                 <w:sz w:val="18"/>
               </w:rPr>
-              <w:t>☐ OK</w:t>
+              <w:t>☐ PASS</w:t>
               <w:br/>
               <w:t>☐ FAIL</w:t>
             </w:r>
@@ -8688,7 +8688,7 @@
               <w:rPr>
                 <w:sz w:val="18"/>
               </w:rPr>
-              <w:t>☐ OK</w:t>
+              <w:t>☐ PASS</w:t>
               <w:br/>
               <w:t>☐ FAIL</w:t>
             </w:r>
@@ -8794,7 +8794,7 @@
               <w:rPr>
                 <w:sz w:val="18"/>
               </w:rPr>
-              <w:t>☐ OK</w:t>
+              <w:t>☐ PASS</w:t>
               <w:br/>
               <w:t>☐ FAIL</w:t>
             </w:r>
@@ -8922,7 +8922,7 @@
               <w:rPr>
                 <w:sz w:val="18"/>
               </w:rPr>
-              <w:t>☐ OK</w:t>
+              <w:t>☐ PASS</w:t>
               <w:br/>
               <w:t>☐ FAIL</w:t>
             </w:r>
@@ -9028,7 +9028,7 @@
               <w:rPr>
                 <w:sz w:val="18"/>
               </w:rPr>
-              <w:t>☐ OK</w:t>
+              <w:t>☐ PASS</w:t>
               <w:br/>
               <w:t>☐ FAIL</w:t>
             </w:r>
@@ -9134,7 +9134,7 @@
               <w:rPr>
                 <w:sz w:val="18"/>
               </w:rPr>
-              <w:t>☐ OK</w:t>
+              <w:t>☐ PASS</w:t>
               <w:br/>
               <w:t>☐ FAIL</w:t>
             </w:r>
@@ -9199,7 +9199,7 @@
                 <w:b/>
                 <w:sz w:val="18"/>
               </w:rPr>
-              <w:t>Проверка</w:t>
+              <w:t>Test case</w:t>
             </w:r>
           </w:p>
         </w:tc>
@@ -9215,7 +9215,7 @@
                 <w:b/>
                 <w:sz w:val="18"/>
               </w:rPr>
-              <w:t>Предусловия</w:t>
+              <w:t>Preconditions</w:t>
             </w:r>
           </w:p>
         </w:tc>
@@ -9231,7 +9231,7 @@
                 <w:b/>
                 <w:sz w:val="18"/>
               </w:rPr>
-              <w:t>Шаги</w:t>
+              <w:t>Steps</w:t>
             </w:r>
           </w:p>
         </w:tc>
@@ -9247,7 +9247,7 @@
                 <w:b/>
                 <w:sz w:val="18"/>
               </w:rPr>
-              <w:t>Ожидаемый результат</w:t>
+              <w:t>Expected result</w:t>
             </w:r>
           </w:p>
         </w:tc>
@@ -9263,7 +9263,7 @@
                 <w:b/>
                 <w:sz w:val="18"/>
               </w:rPr>
-              <w:t>Результат</w:t>
+              <w:t>Result</w:t>
             </w:r>
           </w:p>
         </w:tc>
@@ -9378,7 +9378,7 @@
               <w:rPr>
                 <w:sz w:val="18"/>
               </w:rPr>
-              <w:t>☐ OK</w:t>
+              <w:t>☐ PASS</w:t>
               <w:br/>
               <w:t>☐ FAIL</w:t>
             </w:r>
@@ -9484,7 +9484,7 @@
               <w:rPr>
                 <w:sz w:val="18"/>
               </w:rPr>
-              <w:t>☐ OK</w:t>
+              <w:t>☐ PASS</w:t>
               <w:br/>
               <w:t>☐ FAIL</w:t>
             </w:r>
@@ -9590,7 +9590,7 @@
               <w:rPr>
                 <w:sz w:val="18"/>
               </w:rPr>
-              <w:t>☐ OK</w:t>
+              <w:t>☐ PASS</w:t>
               <w:br/>
               <w:t>☐ FAIL</w:t>
             </w:r>
@@ -9696,7 +9696,7 @@
               <w:rPr>
                 <w:sz w:val="18"/>
               </w:rPr>
-              <w:t>☐ OK</w:t>
+              <w:t>☐ PASS</w:t>
               <w:br/>
               <w:t>☐ FAIL</w:t>
             </w:r>
@@ -9813,7 +9813,7 @@
               <w:rPr>
                 <w:sz w:val="18"/>
               </w:rPr>
-              <w:t>☐ OK</w:t>
+              <w:t>☐ PASS</w:t>
               <w:br/>
               <w:t>☐ FAIL</w:t>
             </w:r>
@@ -9919,7 +9919,7 @@
               <w:rPr>
                 <w:sz w:val="18"/>
               </w:rPr>
-              <w:t>☐ OK</w:t>
+              <w:t>☐ PASS</w:t>
               <w:br/>
               <w:t>☐ FAIL</w:t>
             </w:r>
@@ -10025,7 +10025,7 @@
               <w:rPr>
                 <w:sz w:val="18"/>
               </w:rPr>
-              <w:t>☐ OK</w:t>
+              <w:t>☐ PASS</w:t>
               <w:br/>
               <w:t>☐ FAIL</w:t>
             </w:r>
@@ -10090,7 +10090,7 @@
                 <w:b/>
                 <w:sz w:val="18"/>
               </w:rPr>
-              <w:t>Проверка</w:t>
+              <w:t>Test case</w:t>
             </w:r>
           </w:p>
         </w:tc>
@@ -10106,7 +10106,7 @@
                 <w:b/>
                 <w:sz w:val="18"/>
               </w:rPr>
-              <w:t>Предусловия</w:t>
+              <w:t>Preconditions</w:t>
             </w:r>
           </w:p>
         </w:tc>
@@ -10122,7 +10122,7 @@
                 <w:b/>
                 <w:sz w:val="18"/>
               </w:rPr>
-              <w:t>Шаги</w:t>
+              <w:t>Steps</w:t>
             </w:r>
           </w:p>
         </w:tc>
@@ -10138,7 +10138,7 @@
                 <w:b/>
                 <w:sz w:val="18"/>
               </w:rPr>
-              <w:t>Ожидаемый результат</w:t>
+              <w:t>Expected result</w:t>
             </w:r>
           </w:p>
         </w:tc>
@@ -10154,7 +10154,7 @@
                 <w:b/>
                 <w:sz w:val="18"/>
               </w:rPr>
-              <w:t>Результат</w:t>
+              <w:t>Result</w:t>
             </w:r>
           </w:p>
         </w:tc>
@@ -10269,7 +10269,7 @@
               <w:rPr>
                 <w:sz w:val="18"/>
               </w:rPr>
-              <w:t>☐ OK</w:t>
+              <w:t>☐ PASS</w:t>
               <w:br/>
               <w:t>☐ FAIL</w:t>
             </w:r>
@@ -10375,7 +10375,7 @@
               <w:rPr>
                 <w:sz w:val="18"/>
               </w:rPr>
-              <w:t>☐ OK</w:t>
+              <w:t>☐ PASS</w:t>
               <w:br/>
               <w:t>☐ FAIL</w:t>
             </w:r>
@@ -10514,7 +10514,7 @@
               <w:rPr>
                 <w:sz w:val="18"/>
               </w:rPr>
-              <w:t>☐ OK</w:t>
+              <w:t>☐ PASS</w:t>
               <w:br/>
               <w:t>☐ FAIL</w:t>
             </w:r>
@@ -10620,7 +10620,7 @@
               <w:rPr>
                 <w:sz w:val="18"/>
               </w:rPr>
-              <w:t>☐ OK</w:t>
+              <w:t>☐ PASS</w:t>
               <w:br/>
               <w:t>☐ FAIL</w:t>
             </w:r>
@@ -10737,7 +10737,7 @@
               <w:rPr>
                 <w:sz w:val="18"/>
               </w:rPr>
-              <w:t>☐ OK</w:t>
+              <w:t>☐ PASS</w:t>
               <w:br/>
               <w:t>☐ FAIL</w:t>
             </w:r>
@@ -10802,7 +10802,7 @@
                 <w:b/>
                 <w:sz w:val="18"/>
               </w:rPr>
-              <w:t>Проверка</w:t>
+              <w:t>Test case</w:t>
             </w:r>
           </w:p>
         </w:tc>
@@ -10818,7 +10818,7 @@
                 <w:b/>
                 <w:sz w:val="18"/>
               </w:rPr>
-              <w:t>Предусловия</w:t>
+              <w:t>Preconditions</w:t>
             </w:r>
           </w:p>
         </w:tc>
@@ -10834,7 +10834,7 @@
                 <w:b/>
                 <w:sz w:val="18"/>
               </w:rPr>
-              <w:t>Шаги</w:t>
+              <w:t>Steps</w:t>
             </w:r>
           </w:p>
         </w:tc>
@@ -10850,7 +10850,7 @@
                 <w:b/>
                 <w:sz w:val="18"/>
               </w:rPr>
-              <w:t>Ожидаемый результат</w:t>
+              <w:t>Expected result</w:t>
             </w:r>
           </w:p>
         </w:tc>
@@ -10866,7 +10866,7 @@
                 <w:b/>
                 <w:sz w:val="18"/>
               </w:rPr>
-              <w:t>Результат</w:t>
+              <w:t>Result</w:t>
             </w:r>
           </w:p>
         </w:tc>
@@ -10970,7 +10970,7 @@
               <w:rPr>
                 <w:sz w:val="18"/>
               </w:rPr>
-              <w:t>☐ OK</w:t>
+              <w:t>☐ PASS</w:t>
               <w:br/>
               <w:t>☐ FAIL</w:t>
             </w:r>
@@ -11076,7 +11076,7 @@
               <w:rPr>
                 <w:sz w:val="18"/>
               </w:rPr>
-              <w:t>☐ OK</w:t>
+              <w:t>☐ PASS</w:t>
               <w:br/>
               <w:t>☐ FAIL</w:t>
             </w:r>
@@ -11204,7 +11204,7 @@
               <w:rPr>
                 <w:sz w:val="18"/>
               </w:rPr>
-              <w:t>☐ OK</w:t>
+              <w:t>☐ PASS</w:t>
               <w:br/>
               <w:t>☐ FAIL</w:t>
             </w:r>
@@ -11321,7 +11321,7 @@
               <w:rPr>
                 <w:sz w:val="18"/>
               </w:rPr>
-              <w:t>☐ OK</w:t>
+              <w:t>☐ PASS</w:t>
               <w:br/>
               <w:t>☐ FAIL</w:t>
             </w:r>
@@ -11438,7 +11438,7 @@
               <w:rPr>
                 <w:sz w:val="18"/>
               </w:rPr>
-              <w:t>☐ OK</w:t>
+              <w:t>☐ PASS</w:t>
               <w:br/>
               <w:t>☐ FAIL</w:t>
             </w:r>
@@ -11544,7 +11544,7 @@
               <w:rPr>
                 <w:sz w:val="18"/>
               </w:rPr>
-              <w:t>☐ OK</w:t>
+              <w:t>☐ PASS</w:t>
               <w:br/>
               <w:t>☐ FAIL</w:t>
             </w:r>
@@ -11562,7 +11562,7 @@
         <w:pStyle w:val="Heading2"/>
       </w:pPr>
       <w:r>
-        <w:t>5.12 API (для тестировщиков с терминалом)</w:t>
+        <w:t>5.12 API testing (для тестировщиков с терминалом)</w:t>
       </w:r>
     </w:p>
     <w:p>
@@ -11621,7 +11621,7 @@
                 <w:b/>
                 <w:sz w:val="18"/>
               </w:rPr>
-              <w:t>Проверка</w:t>
+              <w:t>Test case</w:t>
             </w:r>
           </w:p>
         </w:tc>
@@ -11637,7 +11637,7 @@
                 <w:b/>
                 <w:sz w:val="18"/>
               </w:rPr>
-              <w:t>Предусловия</w:t>
+              <w:t>Preconditions</w:t>
             </w:r>
           </w:p>
         </w:tc>
@@ -11653,7 +11653,7 @@
                 <w:b/>
                 <w:sz w:val="18"/>
               </w:rPr>
-              <w:t>Шаги</w:t>
+              <w:t>Steps</w:t>
             </w:r>
           </w:p>
         </w:tc>
@@ -11669,7 +11669,7 @@
                 <w:b/>
                 <w:sz w:val="18"/>
               </w:rPr>
-              <w:t>Ожидаемый результат</w:t>
+              <w:t>Expected result</w:t>
             </w:r>
           </w:p>
         </w:tc>
@@ -11685,7 +11685,7 @@
                 <w:b/>
                 <w:sz w:val="18"/>
               </w:rPr>
-              <w:t>Результат</w:t>
+              <w:t>Result</w:t>
             </w:r>
           </w:p>
         </w:tc>
@@ -11811,7 +11811,7 @@
               <w:rPr>
                 <w:sz w:val="18"/>
               </w:rPr>
-              <w:t>☐ OK</w:t>
+              <w:t>☐ PASS</w:t>
               <w:br/>
               <w:t>☐ FAIL</w:t>
             </w:r>
@@ -11917,7 +11917,7 @@
               <w:rPr>
                 <w:sz w:val="18"/>
               </w:rPr>
-              <w:t>☐ OK</w:t>
+              <w:t>☐ PASS</w:t>
               <w:br/>
               <w:t>☐ FAIL</w:t>
             </w:r>
@@ -12034,7 +12034,7 @@
               <w:rPr>
                 <w:sz w:val="18"/>
               </w:rPr>
-              <w:t>☐ OK</w:t>
+              <w:t>☐ PASS</w:t>
               <w:br/>
               <w:t>☐ FAIL</w:t>
             </w:r>
@@ -12052,7 +12052,7 @@
         <w:pStyle w:val="Heading1"/>
       </w:pPr>
       <w:r>
-        <w:t>Приложение A. Шаблон отчёта о баге</w:t>
+        <w:t>Приложение A. Шаблон bug report</w:t>
       </w:r>
     </w:p>
     <w:tbl>
@@ -12114,7 +12114,7 @@
               <w:rPr>
                 <w:sz w:val="19"/>
               </w:rPr>
-              <w:t>Заголовок</w:t>
+              <w:t>Title</w:t>
             </w:r>
           </w:p>
         </w:tc>
@@ -12150,7 +12150,7 @@
               <w:rPr>
                 <w:sz w:val="19"/>
               </w:rPr>
-              <w:t>Сборка</w:t>
+              <w:t>Build</w:t>
             </w:r>
           </w:p>
         </w:tc>
@@ -12186,7 +12186,7 @@
               <w:rPr>
                 <w:sz w:val="19"/>
               </w:rPr>
-              <w:t>Устройство</w:t>
+              <w:t>Environment</w:t>
             </w:r>
           </w:p>
         </w:tc>
@@ -12258,7 +12258,7 @@
               <w:rPr>
                 <w:sz w:val="19"/>
               </w:rPr>
-              <w:t>Шаги</w:t>
+              <w:t>Steps to reproduce</w:t>
             </w:r>
           </w:p>
         </w:tc>
@@ -12294,7 +12294,7 @@
               <w:rPr>
                 <w:sz w:val="19"/>
               </w:rPr>
-              <w:t>Ожидание</w:t>
+              <w:t>Expected result</w:t>
             </w:r>
           </w:p>
         </w:tc>
@@ -12311,7 +12311,7 @@
               <w:rPr>
                 <w:sz w:val="19"/>
               </w:rPr>
-              <w:t>Что должно было произойти (из тест-кейса)</w:t>
+              <w:t>Что должно было произойти (из test case)</w:t>
             </w:r>
           </w:p>
         </w:tc>
@@ -12330,7 +12330,7 @@
               <w:rPr>
                 <w:sz w:val="19"/>
               </w:rPr>
-              <w:t>Факт</w:t>
+              <w:t>Actual result</w:t>
             </w:r>
           </w:p>
         </w:tc>
@@ -12366,7 +12366,7 @@
               <w:rPr>
                 <w:sz w:val="19"/>
               </w:rPr>
-              <w:t>Время</w:t>
+              <w:t>Timestamp</w:t>
             </w:r>
           </w:p>
         </w:tc>
@@ -12383,7 +12383,7 @@
               <w:rPr>
                 <w:sz w:val="19"/>
               </w:rPr>
-              <w:t>Дата и время события с точностью до минуты — по нему ищут в логах сервера</w:t>
+              <w:t>Дата и время события с точностью до минуты — по нему ищут в server logs</w:t>
             </w:r>
           </w:p>
         </w:tc>
@@ -12402,7 +12402,7 @@
               <w:rPr>
                 <w:sz w:val="19"/>
               </w:rPr>
-              <w:t>Вложения</w:t>
+              <w:t>Attachments</w:t>
             </w:r>
           </w:p>
         </w:tc>
@@ -12419,7 +12419,7 @@
               <w:rPr>
                 <w:sz w:val="19"/>
               </w:rPr>
-              <w:t>Скриншот или запись экрана; для долгих ожиданий — сколько секунд ждали</w:t>
+              <w:t>Скриншот или screen recording; для долгих ожиданий — сколько секунд ждали</w:t>
             </w:r>
           </w:p>
         </w:tc>
@@ -12438,7 +12438,7 @@
               <w:rPr>
                 <w:sz w:val="19"/>
               </w:rPr>
-              <w:t>Воспроизводимость</w:t>
+              <w:t>Reproducibility</w:t>
             </w:r>
           </w:p>
         </w:tc>
@@ -12455,7 +12455,7 @@
               <w:rPr>
                 <w:sz w:val="19"/>
               </w:rPr>
-              <w:t>Всегда / иногда (сколько раз из скольких)</w:t>
+              <w:t>Always / sometimes (сколько раз из скольких)</w:t>
             </w:r>
           </w:p>
         </w:tc>
@@ -12474,7 +12474,7 @@
               <w:rPr>
                 <w:sz w:val="19"/>
               </w:rPr>
-              <w:t>Серьёзность</w:t>
+              <w:t>Severity</w:t>
             </w:r>
           </w:p>
         </w:tc>
@@ -12491,7 +12491,7 @@
               <w:rPr>
                 <w:sz w:val="19"/>
               </w:rPr>
-              <w:t>Блокер (нельзя продолжать) / Серьёзный (функция не работает) / Мелкий (косметика, опечатка)</w:t>
+              <w:t>Blocker (нельзя продолжать) / Major (функция не работает) / Minor (косметика, опечатка)</w:t>
             </w:r>
           </w:p>
         </w:tc>
@@ -12507,7 +12507,7 @@
         <w:pStyle w:val="Heading1"/>
       </w:pPr>
       <w:r>
-        <w:t>Приложение B. Что не считается багом</w:t>
+        <w:t>Приложение B. Что не считается bug</w:t>
       </w:r>
     </w:p>
     <w:p>
@@ -12516,7 +12516,7 @@
         <w:spacing w:after="40"/>
       </w:pPr>
       <w:r>
-        <w:t>Разные формулировки уроков и вопросов у разных тестировщиков: уроки генерируются моделью и не повторяются дословно. Баг — если урок не соответствует теме, содержит ошибку в фактах или ломает формат (например, нет ни одной практики).</w:t>
+        <w:t>Разные формулировки уроков и вопросов у разных тестировщиков: уроки генерируются моделью и не повторяются дословно. Bug — если урок не соответствует теме, содержит ошибку в фактах или ломает формат (например, нет ни одной практики).</w:t>
       </w:r>
     </w:p>
     <w:p>

</xml_diff>

<commit_message>
Tester feedback on build 15: one-word names, all-subjects references, roomier answer field
The answer field was still cramped: it now starts at 132pt for a short
answer and 200pt for a free one, so the text wraps instead of scrolling
inside a narrow strip.

References open on an "Все" tab like reviews do, listing every subject's
glossaries with the subject named on each card; the tabs appear only
when more than one subject has data.

A subject's display name is one word, two short ones only when one will
not do: the model is asked for that, and the deterministic fallback
(ShortTitle / shortTitle) keeps the significant word — "публичные
выступления перед руководством" becomes "Выступления". A focus title is
trimmed by words to 30 characters, since it is printed next to the name.
The demo subject is renamed to "Выступления" and the English demo focus
is "Рассказ о себе".

Co-Authored-By: Claude Opus 5 <noreply@anthropic.com>
</commit_message>
<xml_diff>
--- a/docs/qa/Teach — тестовая документация QA.docx
+++ b/docs/qa/Teach — тестовая документация QA.docx
@@ -1352,7 +1352,7 @@
               <w:rPr>
                 <w:sz w:val="19"/>
               </w:rPr>
-              <w:t>Два демо-предмета «Английский» и «Публичные выступления» с чипом «демо» и строкой «Этап 1/5 · … · урок 2»; карточка повторов с числом карточек</w:t>
+              <w:t>Два демо-предмета «Английский» и «Выступления» с чипом «демо» и строкой «Этап 1/5 · … · урок 2»; карточка повторов с числом карточек</w:t>
             </w:r>
           </w:p>
         </w:tc>
@@ -1887,7 +1887,7 @@
           <w:b w:val="0"/>
           <w:i w:val="0"/>
         </w:rPr>
-        <w:t>Обозначения: «свой предмет» — предмет, созданный через мастер; «демо» — предустановленные «Английский» и «Публичные выступления». В steps «→» означает переход. Preconditions описывают состояние до первого шага.</w:t>
+        <w:t>Обозначения: «свой предмет» — предмет, созданный через мастер; «демо» — предустановленные «Английский» и «Выступления». В steps «→» означает переход. Preconditions описывают состояние до первого шага.</w:t>
       </w:r>
     </w:p>
     <w:p>
@@ -2721,7 +2721,7 @@
               <w:rPr>
                 <w:sz w:val="18"/>
               </w:rPr>
-              <w:t>«Английский» (Рассказ о себе) и «Публичные выступления» (Структура речи), у каждого чип «демо», индикатор из 5 сегментов и строка «Этап 1/5 · Каркас и термины · урок 2», «Урок готов», кнопка «Начать»</w:t>
+              <w:t>«Английский» (Рассказ о себе) и «Выступления» (Структура речи), у каждого чип «демо», индикатор из 5 сегментов и строка «Этап 1/5 · Каркас и термины · урок 2», «Урок готов», кнопка «Начать»</w:t>
             </w:r>
           </w:p>
         </w:tc>
@@ -4518,7 +4518,7 @@
               <w:rPr>
                 <w:sz w:val="18"/>
               </w:rPr>
-              <w:t>Кикер «ЗАЧЕМ · миссия…», заголовок, 1–2 абзаца, карточка «ПРИМЕР», строка источника с номером. Слова «доверие высокое» отсутствуют; у среднего или низкого доверия — предупреждение цветом (демо «Публичные выступления»)</w:t>
+              <w:t>Кикер «ЗАЧЕМ · миссия…», заголовок, 1–2 абзаца, карточка «ПРИМЕР», строка источника с номером. Слова «доверие высокое» отсутствуют; у среднего или низкого доверия — предупреждение цветом (демо «Выступления»)</w:t>
             </w:r>
           </w:p>
         </w:tc>
@@ -9868,7 +9868,7 @@
               <w:rPr>
                 <w:sz w:val="18"/>
               </w:rPr>
-              <w:t>Демо «Публичные выступления»</w:t>
+              <w:t>Демо «Выступления»</w:t>
             </w:r>
           </w:p>
         </w:tc>
@@ -12936,7 +12936,7 @@
               <w:rPr>
                 <w:sz w:val="19"/>
               </w:rPr>
-              <w:t>Предустановленные «Английский» и «Публичные выступления», сгенерированы сервером и зашиты в приложение</w:t>
+              <w:t>Предустановленные «Английский» и «Выступления», сгенерированы сервером и зашиты в приложение</w:t>
             </w:r>
           </w:p>
         </w:tc>

</xml_diff>